<commit_message>
docs(clg-r): finalize Version 2.0 incorporating dual-reviewer panel feedback on exact Lipschitz bounds and Fourier non-degeneracy
</commit_message>
<xml_diff>
--- a/Publicacoes/RespostaAoProfessor_Analise10.docx
+++ b/Publicacoes/RespostaAoProfessor_Analise10.docx
@@ -690,7 +690,7 @@
           <w:rFonts w:ascii="Calibri" w:hAnsi="Calibri"/>
           <w:sz w:val="22"/>
         </w:rPr>
-        <w:t>onde $W(x) = \text{diag}(w_1(x), \dots, w_M(x))$ com $w_c(x) = \frac{\beta}{4} \sigma(\beta g_c(x))[1 - \sigma(\beta g_c(x))] &gt; 0$ para todo $x \in \mathbb{R}^N$ e $\beta &lt; \infty$.</w:t>
+        <w:t>onde $W(x) = \text{diag}(w_1(x), \dots, w_M(x))$ com $w_c(x) = \beta \sigma(\beta g_c(x))[1 - \sigma(\beta g_c(x))] &gt; 0$ para todo $x \in \mathbb{R}^N$ e $\beta &lt; \infty$.</w:t>
       </w:r>
     </w:p>
     <w:p>
@@ -795,7 +795,7 @@
           <w:rFonts w:ascii="Calibri" w:hAnsi="Calibri"/>
           <w:sz w:val="22"/>
         </w:rPr>
-        <w:t>- **Cota Superior:** Para qualquer ponto $x$, como $w_c(x) \le \beta/16$, temos:</w:t>
+        <w:t>- **Cota Superior:** Para qualquer ponto $x$, como $w_c(x) \le \beta/4$, temos:</w:t>
       </w:r>
     </w:p>
     <w:p>
@@ -804,7 +804,7 @@
           <w:rFonts w:ascii="Calibri" w:hAnsi="Calibri"/>
           <w:sz w:val="22"/>
         </w:rPr>
-        <w:t>$$\|\nabla^2 \Phi_{\text{soft}}(x)\|_2 \le \frac{\beta}{16} \|V^T V\|_2 \le \frac{3 d_{\max}}{16} \beta \implies L_\beta = \mathcal{O}(\beta)$$</w:t>
+        <w:t>$$\|\nabla^2 \Phi_{\text{soft}}(x)\|_2 \le \frac{\beta}{4} \|V^T V\|_2 \le \frac{3 d_{\max}}{4} \beta \implies L_\beta = \mathcal{O}(\beta)$$</w:t>
       </w:r>
     </w:p>
     <w:p>
@@ -813,7 +813,7 @@
           <w:rFonts w:ascii="Calibri" w:hAnsi="Calibri"/>
           <w:sz w:val="22"/>
         </w:rPr>
-        <w:t>- **Cota Inferior:** Seja $x_0$ um ponto pertencente a um hiperplano de cláusula ativa onde $g_c(x_0) = 0$. Nesse ponto, $\sigma(\beta g_c(x_0)) = 1/2$, de modo que $w_c(x_0) = \beta/16$. Tomando $z = v_c / \|v_c\|_2$:</w:t>
+        <w:t>- **Cota Inferior:** Seja $x_0$ um ponto pertencente a um hiperplano de cláusula ativa onde $g_c(x_0) = 0$. Nesse ponto, $\sigma(\beta g_c(x_0)) = 1/2$, de modo que $w_c(x_0) = \beta/4$. Tomando $z = v_c / \|v_c\|_2$:</w:t>
       </w:r>
     </w:p>
     <w:p>
@@ -822,7 +822,7 @@
           <w:rFonts w:ascii="Calibri" w:hAnsi="Calibri"/>
           <w:sz w:val="22"/>
         </w:rPr>
-        <w:t>$$z^T \nabla^2 \Phi_{\text{soft}}(x_0) z \ge w_c(x_0) \|v_c\|_2^2 = \frac{\beta}{16} \cdot \frac{3}{4} = \frac{3}{64} \beta \implies L_\beta \ge \frac{3}{64} \beta$$</w:t>
+        <w:t>$$z^T \nabla^2 \Phi_{\text{soft}}(x_0) z \ge w_c(x_0) \|v_c\|_2^2 = \frac{\beta}{4} \cdot \frac{3}{4} = \frac{3}{16} \beta \implies L_\beta \ge \frac{3}{16} \beta$$</w:t>
       </w:r>
     </w:p>
     <w:p>

</xml_diff>